<commit_message>
Carta MOBIS: argumentos de la RJ 087-2026 y la Directiva 005-2025 (v2)
Co-Authored-By: Claude Opus 5.5 <noreply@anthropic.com>
Claude-Session: https://claude.ai/code/session_01Ls5dNjYBLNjXxuGTDk7v3H
</commit_message>
<xml_diff>
--- a/carta-reclamo/Carta_Bartek_MOBIS_Adhesion.docx
+++ b/carta-reclamo/Carta_Bartek_MOBIS_Adhesion.docx
@@ -172,6 +172,18 @@
       </w:r>
     </w:p>
     <w:p>
+      <w:pPr>
+        <w:numPr>
+          <w:ilvl w:val="0"/>
+          <w:numId w:val="1001"/>
+        </w:numPr>
+        <w:pStyle w:val="Compact"/>
+      </w:pPr>
+      <w:r>
+        <w:t xml:space="preserve">Resolución Jefatural N.° 000087-2026-PERÚ COMPRAS-JEFATURA, del 22 de julio de 2026.</w:t>
+      </w:r>
+    </w:p>
+    <w:p>
       <w:r>
         <w:pict>
           <v:rect style="width:0;height:1.5pt" o:hralign="center" o:hrstd="t" o:hr="t"/>
@@ -455,10 +467,20 @@
         <w:t xml:space="preserve">Resolución Jefatural N.° 000087-2026-PERÚ COMPRAS-JEFATURA</w:t>
       </w:r>
       <w:r>
-        <w:t xml:space="preserve"> </w:t>
-      </w:r>
-      <w:r>
-        <w:t xml:space="preserve">y se comunicó con el</w:t>
+        <w:t xml:space="preserve">, del</w:t>
+      </w:r>
+      <w:r>
+        <w:t xml:space="preserve"> </w:t>
+      </w:r>
+      <w:r>
+        <w:rPr>
+          <w:bCs/>
+          <w:b/>
+        </w:rPr>
+        <w:t xml:space="preserve">22 de julio de 2026</w:t>
+      </w:r>
+      <w:r>
+        <w:t xml:space="preserve">, y se comunicó con el</w:t>
       </w:r>
       <w:r>
         <w:t xml:space="preserve"> </w:t>
@@ -471,7 +493,7 @@
         <w:t xml:space="preserve">Comunicado N.° 040-2026-PERÚ COMPRAS</w:t>
       </w:r>
       <w:r>
-        <w:t xml:space="preserve">, ambos del</w:t>
+        <w:t xml:space="preserve">, del</w:t>
       </w:r>
       <w:r>
         <w:t xml:space="preserve"> </w:t>
@@ -539,69 +561,90 @@
           <w:bCs/>
           <w:b/>
         </w:rPr>
-        <w:t xml:space="preserve">2.2. El Comunicado N.° 080-2025 no aplica a nuestras fichas.</w:t>
-      </w:r>
-      <w:r>
-        <w:t xml:space="preserve"> </w:t>
-      </w:r>
-      <w:r>
-        <w:t xml:space="preserve">Según su propia respuesta, esa suspensión comprendió las fichas</w:t>
-      </w:r>
-      <w:r>
-        <w:t xml:space="preserve"> </w:t>
-      </w:r>
-      <w:r>
-        <w:rPr>
-          <w:bCs/>
-          <w:b/>
-        </w:rPr>
-        <w:t xml:space="preserve">“</w:t>
-      </w:r>
-      <w:r>
-        <w:rPr>
-          <w:bCs/>
-          <w:b/>
-        </w:rPr>
-        <w:t xml:space="preserve">incorporadas, no ofertadas y no adjudicadas</w:t>
-      </w:r>
-      <w:r>
-        <w:rPr>
-          <w:bCs/>
-          <w:b/>
-        </w:rPr>
-        <w:t xml:space="preserve">”</w:t>
-      </w:r>
-      <w:r>
-        <w:t xml:space="preserve">. Nuestras fichas están en estado</w:t>
-      </w:r>
-      <w:r>
-        <w:t xml:space="preserve"> </w:t>
-      </w:r>
-      <w:r>
-        <w:rPr>
-          <w:bCs/>
-          <w:b/>
-        </w:rPr>
-        <w:t xml:space="preserve">OFERTADO</w:t>
-      </w:r>
-      <w:r>
-        <w:t xml:space="preserve">, por lo que</w:t>
-      </w:r>
-      <w:r>
-        <w:t xml:space="preserve"> </w:t>
-      </w:r>
-      <w:r>
-        <w:rPr>
-          <w:bCs/>
-          <w:b/>
-        </w:rPr>
-        <w:t xml:space="preserve">no estaban comprendidas</w:t>
-      </w:r>
-      <w:r>
-        <w:t xml:space="preserve"> </w:t>
-      </w:r>
-      <w:r>
-        <w:t xml:space="preserve">en esa medida.</w:t>
+        <w:t xml:space="preserve">2.2. La norma no ordena bloquear fichas ya ofertadas.</w:t>
+      </w:r>
+      <w:r>
+        <w:t xml:space="preserve"> </w:t>
+      </w:r>
+      <w:r>
+        <w:t xml:space="preserve">La Resolución Jefatural N.° 000087-2026 solo</w:t>
+      </w:r>
+      <w:r>
+        <w:t xml:space="preserve"> </w:t>
+      </w:r>
+      <w:r>
+        <w:rPr>
+          <w:bCs/>
+          <w:b/>
+        </w:rPr>
+        <w:t xml:space="preserve">aprueba el formato</w:t>
+      </w:r>
+      <w:r>
+        <w:t xml:space="preserve"> </w:t>
+      </w:r>
+      <w:r>
+        <w:t xml:space="preserve">del Acuerdo de Adhesión (artículo primero) y autoriza a su Dirección a</w:t>
+      </w:r>
+      <w:r>
+        <w:t xml:space="preserve"> </w:t>
+      </w:r>
+      <w:r>
+        <w:rPr>
+          <w:bCs/>
+          <w:b/>
+        </w:rPr>
+        <w:t xml:space="preserve">difundir los plazos para suscribirlo</w:t>
+      </w:r>
+      <w:r>
+        <w:t xml:space="preserve"> </w:t>
+      </w:r>
+      <w:r>
+        <w:t xml:space="preserve">(artículo segundo).</w:t>
+      </w:r>
+      <w:r>
+        <w:t xml:space="preserve"> </w:t>
+      </w:r>
+      <w:r>
+        <w:rPr>
+          <w:bCs/>
+          <w:b/>
+        </w:rPr>
+        <w:t xml:space="preserve">No dispone</w:t>
+      </w:r>
+      <w:r>
+        <w:t xml:space="preserve"> </w:t>
+      </w:r>
+      <w:r>
+        <w:t xml:space="preserve">que las fichas ya incorporadas y ofertadas dejen de estar disponibles mientras el acuerdo se formaliza. Por su parte, el</w:t>
+      </w:r>
+      <w:r>
+        <w:t xml:space="preserve"> </w:t>
+      </w:r>
+      <w:r>
+        <w:rPr>
+          <w:bCs/>
+          <w:b/>
+        </w:rPr>
+        <w:t xml:space="preserve">artículo 276.1 del Reglamento de la Ley N.° 32069</w:t>
+      </w:r>
+      <w:r>
+        <w:t xml:space="preserve"> </w:t>
+      </w:r>
+      <w:r>
+        <w:t xml:space="preserve">exige al representante de marca mantener las condiciones que motivaron su acreditación, y nuestra empresa</w:t>
+      </w:r>
+      <w:r>
+        <w:t xml:space="preserve"> </w:t>
+      </w:r>
+      <w:r>
+        <w:rPr>
+          <w:bCs/>
+          <w:b/>
+        </w:rPr>
+        <w:t xml:space="preserve">las mantiene</w:t>
+      </w:r>
+      <w:r>
+        <w:t xml:space="preserve">.</w:t>
       </w:r>
     </w:p>
     <w:p>
@@ -614,58 +657,69 @@
           <w:bCs/>
           <w:b/>
         </w:rPr>
-        <w:t xml:space="preserve">2.3. El Comunicado N.° 022-2026 tampoco aplica.</w:t>
-      </w:r>
-      <w:r>
-        <w:t xml:space="preserve"> </w:t>
-      </w:r>
-      <w:r>
-        <w:t xml:space="preserve">Ese cronograma era para registrar</w:t>
-      </w:r>
-      <w:r>
-        <w:t xml:space="preserve"> </w:t>
-      </w:r>
-      <w:r>
-        <w:rPr>
-          <w:bCs/>
-          <w:b/>
-        </w:rPr>
-        <w:t xml:space="preserve">nuevas</w:t>
-      </w:r>
-      <w:r>
-        <w:t xml:space="preserve"> </w:t>
-      </w:r>
-      <w:r>
-        <w:t xml:space="preserve">fichas. Nuestro reclamo</w:t>
-      </w:r>
-      <w:r>
-        <w:t xml:space="preserve"> </w:t>
-      </w:r>
-      <w:r>
-        <w:rPr>
-          <w:bCs/>
-          <w:b/>
-        </w:rPr>
-        <w:t xml:space="preserve">no es sobre fichas nuevas</w:t>
-      </w:r>
-      <w:r>
-        <w:t xml:space="preserve">, sino sobre las</w:t>
-      </w:r>
-      <w:r>
-        <w:t xml:space="preserve"> </w:t>
-      </w:r>
-      <w:r>
-        <w:rPr>
-          <w:bCs/>
-          <w:b/>
-        </w:rPr>
-        <w:t xml:space="preserve">22 fichas que ya existen</w:t>
-      </w:r>
-      <w:r>
-        <w:t xml:space="preserve"> </w:t>
-      </w:r>
-      <w:r>
-        <w:t xml:space="preserve">y que su Dirección reconoce como incorporadas.</w:t>
+        <w:t xml:space="preserve">2.3. El Comunicado N.° 080-2025 no aplica a nuestras fichas.</w:t>
+      </w:r>
+      <w:r>
+        <w:t xml:space="preserve"> </w:t>
+      </w:r>
+      <w:r>
+        <w:t xml:space="preserve">Según su propia respuesta, esa suspensión comprendió las fichas</w:t>
+      </w:r>
+      <w:r>
+        <w:t xml:space="preserve"> </w:t>
+      </w:r>
+      <w:r>
+        <w:rPr>
+          <w:bCs/>
+          <w:b/>
+        </w:rPr>
+        <w:t xml:space="preserve">“</w:t>
+      </w:r>
+      <w:r>
+        <w:rPr>
+          <w:bCs/>
+          <w:b/>
+        </w:rPr>
+        <w:t xml:space="preserve">incorporadas, no ofertadas y no adjudicadas</w:t>
+      </w:r>
+      <w:r>
+        <w:rPr>
+          <w:bCs/>
+          <w:b/>
+        </w:rPr>
+        <w:t xml:space="preserve">”</w:t>
+      </w:r>
+      <w:r>
+        <w:t xml:space="preserve">. Nuestras fichas están en estado</w:t>
+      </w:r>
+      <w:r>
+        <w:t xml:space="preserve"> </w:t>
+      </w:r>
+      <w:r>
+        <w:rPr>
+          <w:bCs/>
+          <w:b/>
+        </w:rPr>
+        <w:t xml:space="preserve">OFERTADO</w:t>
+      </w:r>
+      <w:r>
+        <w:t xml:space="preserve">, por lo que</w:t>
+      </w:r>
+      <w:r>
+        <w:t xml:space="preserve"> </w:t>
+      </w:r>
+      <w:r>
+        <w:rPr>
+          <w:bCs/>
+          <w:b/>
+        </w:rPr>
+        <w:t xml:space="preserve">no estaban comprendidas</w:t>
+      </w:r>
+      <w:r>
+        <w:t xml:space="preserve"> </w:t>
+      </w:r>
+      <w:r>
+        <w:t xml:space="preserve">en esa medida.</w:t>
       </w:r>
     </w:p>
     <w:p>
@@ -678,100 +732,58 @@
           <w:bCs/>
           <w:b/>
         </w:rPr>
-        <w:t xml:space="preserve">2.4. El Acuerdo de Adhesión es uno solo y es de SERVICIOS BARTEK E.I.R.L.</w:t>
-      </w:r>
-      <w:r>
-        <w:t xml:space="preserve"> </w:t>
-      </w:r>
-      <w:r>
-        <w:t xml:space="preserve">El Acuerdo lo suscribe</w:t>
-      </w:r>
-      <w:r>
-        <w:t xml:space="preserve"> </w:t>
-      </w:r>
-      <w:r>
-        <w:rPr>
-          <w:bCs/>
-          <w:b/>
-        </w:rPr>
-        <w:t xml:space="preserve">nuestra empresa</w:t>
-      </w:r>
-      <w:r>
-        <w:t xml:space="preserve"> </w:t>
-      </w:r>
-      <w:r>
-        <w:t xml:space="preserve">como representante de marca,</w:t>
-      </w:r>
-      <w:r>
-        <w:t xml:space="preserve"> </w:t>
-      </w:r>
-      <w:r>
-        <w:rPr>
-          <w:bCs/>
-          <w:b/>
-        </w:rPr>
-        <w:t xml:space="preserve">no cada marca por separado</w:t>
-      </w:r>
-      <w:r>
-        <w:t xml:space="preserve">. Nuestras fichas de</w:t>
-      </w:r>
-      <w:r>
-        <w:t xml:space="preserve"> </w:t>
-      </w:r>
-      <w:r>
-        <w:rPr>
-          <w:bCs/>
-          <w:b/>
-        </w:rPr>
-        <w:t xml:space="preserve">aceite vegetal</w:t>
-      </w:r>
-      <w:r>
-        <w:t xml:space="preserve">, incorporadas</w:t>
-      </w:r>
-      <w:r>
-        <w:t xml:space="preserve"> </w:t>
-      </w:r>
-      <w:r>
-        <w:rPr>
-          <w:bCs/>
-          <w:b/>
-        </w:rPr>
-        <w:t xml:space="preserve">después</w:t>
-      </w:r>
-      <w:r>
-        <w:t xml:space="preserve"> </w:t>
-      </w:r>
-      <w:r>
-        <w:t xml:space="preserve">que las de MOBIS, dependen del</w:t>
-      </w:r>
-      <w:r>
-        <w:t xml:space="preserve"> </w:t>
-      </w:r>
-      <w:r>
-        <w:rPr>
-          <w:bCs/>
-          <w:b/>
-        </w:rPr>
-        <w:t xml:space="preserve">mismo Acuerdo de Adhesión</w:t>
-      </w:r>
-      <w:r>
-        <w:t xml:space="preserve">. Si ese trámite pendiente impide ofertar, debe afectar por igual a todas nuestras marcas. Si no las afecta,</w:t>
-      </w:r>
-      <w:r>
-        <w:t xml:space="preserve"> </w:t>
-      </w:r>
-      <w:r>
-        <w:rPr>
-          <w:bCs/>
-          <w:b/>
-        </w:rPr>
-        <w:t xml:space="preserve">la falta de formalización no es la causa</w:t>
-      </w:r>
-      <w:r>
-        <w:t xml:space="preserve"> </w:t>
-      </w:r>
-      <w:r>
-        <w:t xml:space="preserve">de que las fichas MOBIS no se vean, y su Dirección debe informarnos la causa real.</w:t>
+        <w:t xml:space="preserve">2.4. El Comunicado N.° 022-2026 tampoco aplica.</w:t>
+      </w:r>
+      <w:r>
+        <w:t xml:space="preserve"> </w:t>
+      </w:r>
+      <w:r>
+        <w:t xml:space="preserve">Ese cronograma era para registrar</w:t>
+      </w:r>
+      <w:r>
+        <w:t xml:space="preserve"> </w:t>
+      </w:r>
+      <w:r>
+        <w:rPr>
+          <w:bCs/>
+          <w:b/>
+        </w:rPr>
+        <w:t xml:space="preserve">nuevas</w:t>
+      </w:r>
+      <w:r>
+        <w:t xml:space="preserve"> </w:t>
+      </w:r>
+      <w:r>
+        <w:t xml:space="preserve">fichas. Nuestro reclamo</w:t>
+      </w:r>
+      <w:r>
+        <w:t xml:space="preserve"> </w:t>
+      </w:r>
+      <w:r>
+        <w:rPr>
+          <w:bCs/>
+          <w:b/>
+        </w:rPr>
+        <w:t xml:space="preserve">no es sobre fichas nuevas</w:t>
+      </w:r>
+      <w:r>
+        <w:t xml:space="preserve">, sino sobre las</w:t>
+      </w:r>
+      <w:r>
+        <w:t xml:space="preserve"> </w:t>
+      </w:r>
+      <w:r>
+        <w:rPr>
+          <w:bCs/>
+          <w:b/>
+        </w:rPr>
+        <w:t xml:space="preserve">22 fichas que ya existen</w:t>
+      </w:r>
+      <w:r>
+        <w:t xml:space="preserve"> </w:t>
+      </w:r>
+      <w:r>
+        <w:t xml:space="preserve">y que su Dirección reconoce como incorporadas.</w:t>
       </w:r>
     </w:p>
     <w:p>
@@ -784,96 +796,100 @@
           <w:bCs/>
           <w:b/>
         </w:rPr>
-        <w:t xml:space="preserve">2.5. La demora es de PERÚ COMPRAS, no nuestra.</w:t>
-      </w:r>
-      <w:r>
-        <w:t xml:space="preserve"> </w:t>
-      </w:r>
-      <w:r>
-        <w:t xml:space="preserve">PERÚ COMPRAS fijó como plazo para suscribir el Acuerdo de Adhesión el</w:t>
-      </w:r>
-      <w:r>
-        <w:t xml:space="preserve"> </w:t>
-      </w:r>
-      <w:r>
-        <w:rPr>
-          <w:bCs/>
-          <w:b/>
-        </w:rPr>
-        <w:t xml:space="preserve">31 de julio de 2026</w:t>
-      </w:r>
-      <w:r>
-        <w:t xml:space="preserve">, y de manera excepcional el</w:t>
-      </w:r>
-      <w:r>
-        <w:t xml:space="preserve"> </w:t>
-      </w:r>
-      <w:r>
-        <w:rPr>
-          <w:bCs/>
-          <w:b/>
-        </w:rPr>
-        <w:t xml:space="preserve">07 de agosto de 2026</w:t>
-      </w:r>
-      <w:r>
-        <w:t xml:space="preserve">. Nosotros cumplimos. Han pasado</w:t>
-      </w:r>
-      <w:r>
-        <w:t xml:space="preserve"> </w:t>
-      </w:r>
-      <w:r>
-        <w:rPr>
-          <w:bCs/>
-          <w:b/>
-        </w:rPr>
-        <w:t xml:space="preserve">más de dos meses</w:t>
-      </w:r>
-      <w:r>
-        <w:t xml:space="preserve"> </w:t>
-      </w:r>
-      <w:r>
-        <w:t xml:space="preserve">y la formalización sigue</w:t>
-      </w:r>
-      <w:r>
-        <w:t xml:space="preserve"> </w:t>
-      </w:r>
-      <w:r>
-        <w:t xml:space="preserve">“</w:t>
-      </w:r>
-      <w:r>
-        <w:t xml:space="preserve">en trámite</w:t>
-      </w:r>
-      <w:r>
-        <w:t xml:space="preserve">”</w:t>
-      </w:r>
-      <w:r>
-        <w:t xml:space="preserve">,</w:t>
-      </w:r>
-      <w:r>
-        <w:t xml:space="preserve"> </w:t>
-      </w:r>
-      <w:r>
-        <w:rPr>
-          <w:bCs/>
-          <w:b/>
-        </w:rPr>
-        <w:t xml:space="preserve">sin plazo ni fecha</w:t>
-      </w:r>
-      <w:r>
-        <w:t xml:space="preserve">. Mientras tanto, nuestra empresa y los proveedores pierden periodos de oferta</w:t>
-      </w:r>
-      <w:r>
-        <w:t xml:space="preserve"> </w:t>
-      </w:r>
-      <w:r>
-        <w:rPr>
-          <w:bCs/>
-          <w:b/>
-        </w:rPr>
-        <w:t xml:space="preserve">por causas que no nos son imputables</w:t>
-      </w:r>
-      <w:r>
-        <w:t xml:space="preserve">.</w:t>
+        <w:t xml:space="preserve">2.5. El Acuerdo de Adhesión es uno solo y es de SERVICIOS BARTEK E.I.R.L.</w:t>
+      </w:r>
+      <w:r>
+        <w:t xml:space="preserve"> </w:t>
+      </w:r>
+      <w:r>
+        <w:t xml:space="preserve">El Acuerdo lo suscribe</w:t>
+      </w:r>
+      <w:r>
+        <w:t xml:space="preserve"> </w:t>
+      </w:r>
+      <w:r>
+        <w:rPr>
+          <w:bCs/>
+          <w:b/>
+        </w:rPr>
+        <w:t xml:space="preserve">nuestra empresa</w:t>
+      </w:r>
+      <w:r>
+        <w:t xml:space="preserve"> </w:t>
+      </w:r>
+      <w:r>
+        <w:t xml:space="preserve">como representante de marca,</w:t>
+      </w:r>
+      <w:r>
+        <w:t xml:space="preserve"> </w:t>
+      </w:r>
+      <w:r>
+        <w:rPr>
+          <w:bCs/>
+          <w:b/>
+        </w:rPr>
+        <w:t xml:space="preserve">no cada marca por separado</w:t>
+      </w:r>
+      <w:r>
+        <w:t xml:space="preserve">. Nuestras fichas de</w:t>
+      </w:r>
+      <w:r>
+        <w:t xml:space="preserve"> </w:t>
+      </w:r>
+      <w:r>
+        <w:rPr>
+          <w:bCs/>
+          <w:b/>
+        </w:rPr>
+        <w:t xml:space="preserve">aceite vegetal</w:t>
+      </w:r>
+      <w:r>
+        <w:t xml:space="preserve">, incorporadas</w:t>
+      </w:r>
+      <w:r>
+        <w:t xml:space="preserve"> </w:t>
+      </w:r>
+      <w:r>
+        <w:rPr>
+          <w:bCs/>
+          <w:b/>
+        </w:rPr>
+        <w:t xml:space="preserve">después</w:t>
+      </w:r>
+      <w:r>
+        <w:t xml:space="preserve"> </w:t>
+      </w:r>
+      <w:r>
+        <w:t xml:space="preserve">que las de MOBIS, dependen del</w:t>
+      </w:r>
+      <w:r>
+        <w:t xml:space="preserve"> </w:t>
+      </w:r>
+      <w:r>
+        <w:rPr>
+          <w:bCs/>
+          <w:b/>
+        </w:rPr>
+        <w:t xml:space="preserve">mismo Acuerdo de Adhesión</w:t>
+      </w:r>
+      <w:r>
+        <w:t xml:space="preserve">. Si ese trámite pendiente impide ofertar, debe afectar por igual a todas nuestras marcas. Si no las afecta,</w:t>
+      </w:r>
+      <w:r>
+        <w:t xml:space="preserve"> </w:t>
+      </w:r>
+      <w:r>
+        <w:rPr>
+          <w:bCs/>
+          <w:b/>
+        </w:rPr>
+        <w:t xml:space="preserve">la falta de formalización no es la causa</w:t>
+      </w:r>
+      <w:r>
+        <w:t xml:space="preserve"> </w:t>
+      </w:r>
+      <w:r>
+        <w:t xml:space="preserve">de que las fichas MOBIS no se vean, y su Dirección debe informarnos la causa real.</w:t>
       </w:r>
     </w:p>
     <w:p>
@@ -886,7 +902,148 @@
           <w:bCs/>
           <w:b/>
         </w:rPr>
-        <w:t xml:space="preserve">2.6. Se afectan los principios de la contratación pública.</w:t>
+        <w:t xml:space="preserve">2.6. La demora es de PERÚ COMPRAS, no nuestra.</w:t>
+      </w:r>
+      <w:r>
+        <w:t xml:space="preserve"> </w:t>
+      </w:r>
+      <w:r>
+        <w:t xml:space="preserve">Según el</w:t>
+      </w:r>
+      <w:r>
+        <w:t xml:space="preserve"> </w:t>
+      </w:r>
+      <w:r>
+        <w:rPr>
+          <w:bCs/>
+          <w:b/>
+        </w:rPr>
+        <w:t xml:space="preserve">literal b) del numeral 9.1.2 de la Directiva N.° 005-2025-PERÚ COMPRAS (Versión 2)</w:t>
+      </w:r>
+      <w:r>
+        <w:t xml:space="preserve">, aprobada por Resolución Jefatural-D N.° 000096-2025-PERÚ COMPRAS-JEFATURA, la formalización del Acuerdo de Adhesión</w:t>
+      </w:r>
+      <w:r>
+        <w:t xml:space="preserve"> </w:t>
+      </w:r>
+      <w:r>
+        <w:rPr>
+          <w:bCs/>
+          <w:b/>
+        </w:rPr>
+        <w:t xml:space="preserve">corresponde a su Dirección, previa autorización de la Jefatura de PERÚ COMPRAS</w:t>
+      </w:r>
+      <w:r>
+        <w:t xml:space="preserve">. Es decir,</w:t>
+      </w:r>
+      <w:r>
+        <w:t xml:space="preserve"> </w:t>
+      </w:r>
+      <w:r>
+        <w:rPr>
+          <w:bCs/>
+          <w:b/>
+        </w:rPr>
+        <w:t xml:space="preserve">depende solo de la entidad</w:t>
+      </w:r>
+      <w:r>
+        <w:t xml:space="preserve">. PERÚ COMPRAS fijó como plazo para suscribir el Acuerdo de Adhesión el</w:t>
+      </w:r>
+      <w:r>
+        <w:t xml:space="preserve"> </w:t>
+      </w:r>
+      <w:r>
+        <w:rPr>
+          <w:bCs/>
+          <w:b/>
+        </w:rPr>
+        <w:t xml:space="preserve">31 de julio de 2026</w:t>
+      </w:r>
+      <w:r>
+        <w:t xml:space="preserve">, y de manera excepcional el</w:t>
+      </w:r>
+      <w:r>
+        <w:t xml:space="preserve"> </w:t>
+      </w:r>
+      <w:r>
+        <w:rPr>
+          <w:bCs/>
+          <w:b/>
+        </w:rPr>
+        <w:t xml:space="preserve">07 de agosto de 2026</w:t>
+      </w:r>
+      <w:r>
+        <w:t xml:space="preserve">. Nosotros cumplimos. Han pasado</w:t>
+      </w:r>
+      <w:r>
+        <w:t xml:space="preserve"> </w:t>
+      </w:r>
+      <w:r>
+        <w:rPr>
+          <w:bCs/>
+          <w:b/>
+        </w:rPr>
+        <w:t xml:space="preserve">más de dos meses</w:t>
+      </w:r>
+      <w:r>
+        <w:t xml:space="preserve"> </w:t>
+      </w:r>
+      <w:r>
+        <w:t xml:space="preserve">y la formalización sigue</w:t>
+      </w:r>
+      <w:r>
+        <w:t xml:space="preserve"> </w:t>
+      </w:r>
+      <w:r>
+        <w:t xml:space="preserve">“</w:t>
+      </w:r>
+      <w:r>
+        <w:t xml:space="preserve">en trámite</w:t>
+      </w:r>
+      <w:r>
+        <w:t xml:space="preserve">”</w:t>
+      </w:r>
+      <w:r>
+        <w:t xml:space="preserve">,</w:t>
+      </w:r>
+      <w:r>
+        <w:t xml:space="preserve"> </w:t>
+      </w:r>
+      <w:r>
+        <w:rPr>
+          <w:bCs/>
+          <w:b/>
+        </w:rPr>
+        <w:t xml:space="preserve">sin plazo ni fecha</w:t>
+      </w:r>
+      <w:r>
+        <w:t xml:space="preserve">. Mientras tanto, nuestra empresa y los proveedores pierden periodos de oferta</w:t>
+      </w:r>
+      <w:r>
+        <w:t xml:space="preserve"> </w:t>
+      </w:r>
+      <w:r>
+        <w:rPr>
+          <w:bCs/>
+          <w:b/>
+        </w:rPr>
+        <w:t xml:space="preserve">por causas que no nos son imputables</w:t>
+      </w:r>
+      <w:r>
+        <w:t xml:space="preserve">.</w:t>
+      </w:r>
+    </w:p>
+    <w:p>
+      <w:pPr>
+        <w:pStyle w:val="BodyText"/>
+        <w:jc w:val="both"/>
+      </w:pPr>
+      <w:r>
+        <w:rPr>
+          <w:bCs/>
+          <w:b/>
+        </w:rPr>
+        <w:t xml:space="preserve">2.7. Se afectan los principios de la contratación pública.</w:t>
       </w:r>
       <w:r>
         <w:t xml:space="preserve"> </w:t>
@@ -1153,10 +1310,10 @@
           <w:bCs/>
           <w:b/>
         </w:rPr>
-        <w:t xml:space="preserve">antes del 24 de julio de 2026</w:t>
-      </w:r>
-      <w:r>
-        <w:t xml:space="preserve">, fecha en que se creó el requisito del Acuerdo de Adhesión.</w:t>
+        <w:t xml:space="preserve">antes del 22 de julio de 2026</w:t>
+      </w:r>
+      <w:r>
+        <w:t xml:space="preserve">, fecha en que se aprobó el formato del Acuerdo de Adhesión.</w:t>
       </w:r>
     </w:p>
     <w:p>

</xml_diff>

<commit_message>
Carta MOBIS: pedir sustento de visibilidad de las fichas en lugar de afirmarlo
Co-Authored-By: Claude Opus 5.5 <noreply@anthropic.com>
Claude-Session: https://claude.ai/code/session_01Ls5dNjYBLNjXxuGTDk7v3H
</commit_message>
<xml_diff>
--- a/carta-reclamo/Carta_Bartek_MOBIS_Adhesion.docx
+++ b/carta-reclamo/Carta_Bartek_MOBIS_Adhesion.docx
@@ -519,36 +519,33 @@
         <w:t xml:space="preserve">mucho antes de esa fecha</w:t>
       </w:r>
       <w:r>
-        <w:t xml:space="preserve">. Sin embargo, los proveedores</w:t>
-      </w:r>
-      <w:r>
-        <w:t xml:space="preserve"> </w:t>
-      </w:r>
-      <w:r>
-        <w:rPr>
-          <w:bCs/>
-          <w:b/>
-        </w:rPr>
-        <w:t xml:space="preserve">no han podido verlas ni ofertarlas</w:t>
-      </w:r>
-      <w:r>
-        <w:t xml:space="preserve">. Un requisito creado en julio de 2026</w:t>
-      </w:r>
-      <w:r>
-        <w:t xml:space="preserve"> </w:t>
-      </w:r>
-      <w:r>
-        <w:rPr>
-          <w:bCs/>
-          <w:b/>
-        </w:rPr>
-        <w:t xml:space="preserve">no puede explicar</w:t>
-      </w:r>
-      <w:r>
-        <w:t xml:space="preserve"> </w:t>
-      </w:r>
-      <w:r>
-        <w:t xml:space="preserve">que nuestras fichas no fueran visibles antes.</w:t>
+        <w:t xml:space="preserve">. Si antes de julio de 2026 los proveedores tampoco podían verlas ni ofertarlas,</w:t>
+      </w:r>
+      <w:r>
+        <w:t xml:space="preserve"> </w:t>
+      </w:r>
+      <w:r>
+        <w:rPr>
+          <w:bCs/>
+          <w:b/>
+        </w:rPr>
+        <w:t xml:space="preserve">un requisito creado después no puede ser la causa</w:t>
+      </w:r>
+      <w:r>
+        <w:t xml:space="preserve">. Si, por el contrario, sí eran visibles, corresponde que su Dirección</w:t>
+      </w:r>
+      <w:r>
+        <w:t xml:space="preserve"> </w:t>
+      </w:r>
+      <w:r>
+        <w:rPr>
+          <w:bCs/>
+          <w:b/>
+        </w:rPr>
+        <w:t xml:space="preserve">lo acredite con los registros de la plataforma</w:t>
+      </w:r>
+      <w:r>
+        <w:t xml:space="preserve">.</w:t>
       </w:r>
     </w:p>
     <w:p>
@@ -1249,35 +1246,96 @@
           <w:numId w:val="1004"/>
         </w:numPr>
         <w:pStyle w:val="Compact"/>
-      </w:pPr>
-      <w:r>
-        <w:rPr>
-          <w:bCs/>
-          <w:b/>
-        </w:rPr>
-        <w:t xml:space="preserve">Desde qué fecha</w:t>
-      </w:r>
-      <w:r>
-        <w:t xml:space="preserve"> </w:t>
-      </w:r>
-      <w:r>
-        <w:t xml:space="preserve">las 22 fichas MOBIS</w:t>
-      </w:r>
-      <w:r>
-        <w:t xml:space="preserve"> </w:t>
-      </w:r>
-      <w:r>
-        <w:rPr>
-          <w:bCs/>
-          <w:b/>
-        </w:rPr>
-        <w:t xml:space="preserve">no están habilitadas</w:t>
-      </w:r>
-      <w:r>
-        <w:t xml:space="preserve"> </w:t>
-      </w:r>
-      <w:r>
-        <w:t xml:space="preserve">para los proveedores.</w:t>
+        <w:jc w:val="both"/>
+      </w:pPr>
+      <w:r>
+        <w:t xml:space="preserve">Si las 22 fichas MOBIS</w:t>
+      </w:r>
+      <w:r>
+        <w:t xml:space="preserve"> </w:t>
+      </w:r>
+      <w:r>
+        <w:rPr>
+          <w:bCs/>
+          <w:b/>
+        </w:rPr>
+        <w:t xml:space="preserve">estuvieron habilitadas y visibles</w:t>
+      </w:r>
+      <w:r>
+        <w:t xml:space="preserve"> </w:t>
+      </w:r>
+      <w:r>
+        <w:t xml:space="preserve">para los proveedores desde su incorporación y</w:t>
+      </w:r>
+      <w:r>
+        <w:t xml:space="preserve"> </w:t>
+      </w:r>
+      <w:r>
+        <w:rPr>
+          <w:bCs/>
+          <w:b/>
+        </w:rPr>
+        <w:t xml:space="preserve">en qué periodos</w:t>
+      </w:r>
+      <w:r>
+        <w:t xml:space="preserve">,</w:t>
+      </w:r>
+      <w:r>
+        <w:t xml:space="preserve"> </w:t>
+      </w:r>
+      <w:r>
+        <w:rPr>
+          <w:bCs/>
+          <w:b/>
+        </w:rPr>
+        <w:t xml:space="preserve">sustentado con los registros de la plataforma</w:t>
+      </w:r>
+      <w:r>
+        <w:t xml:space="preserve"> </w:t>
+      </w:r>
+      <w:r>
+        <w:t xml:space="preserve">(historial de estados y fechas de habilitación de cada ficha).</w:t>
+      </w:r>
+    </w:p>
+    <w:p>
+      <w:pPr>
+        <w:numPr>
+          <w:ilvl w:val="1"/>
+          <w:numId w:val="1004"/>
+        </w:numPr>
+        <w:pStyle w:val="Compact"/>
+      </w:pPr>
+      <w:r>
+        <w:t xml:space="preserve">Si algún proveedor</w:t>
+      </w:r>
+      <w:r>
+        <w:t xml:space="preserve"> </w:t>
+      </w:r>
+      <w:r>
+        <w:rPr>
+          <w:bCs/>
+          <w:b/>
+        </w:rPr>
+        <w:t xml:space="preserve">presentó ofertas</w:t>
+      </w:r>
+      <w:r>
+        <w:t xml:space="preserve"> </w:t>
+      </w:r>
+      <w:r>
+        <w:t xml:space="preserve">sobre nuestras fichas MOBIS y</w:t>
+      </w:r>
+      <w:r>
+        <w:t xml:space="preserve"> </w:t>
+      </w:r>
+      <w:r>
+        <w:rPr>
+          <w:bCs/>
+          <w:b/>
+        </w:rPr>
+        <w:t xml:space="preserve">en qué fechas</w:t>
+      </w:r>
+      <w:r>
+        <w:t xml:space="preserve">.</w:t>
       </w:r>
     </w:p>
     <w:p>
@@ -1294,26 +1352,42 @@
           <w:bCs/>
           <w:b/>
         </w:rPr>
-        <w:t xml:space="preserve">Por qué</w:t>
-      </w:r>
-      <w:r>
-        <w:t xml:space="preserve"> </w:t>
-      </w:r>
-      <w:r>
-        <w:t xml:space="preserve">no fueron visibles</w:t>
-      </w:r>
-      <w:r>
-        <w:t xml:space="preserve"> </w:t>
-      </w:r>
-      <w:r>
-        <w:rPr>
-          <w:bCs/>
-          <w:b/>
-        </w:rPr>
-        <w:t xml:space="preserve">antes del 22 de julio de 2026</w:t>
-      </w:r>
-      <w:r>
-        <w:t xml:space="preserve">, fecha en que se aprobó el formato del Acuerdo de Adhesión.</w:t>
+        <w:t xml:space="preserve">Desde qué fecha</w:t>
+      </w:r>
+      <w:r>
+        <w:t xml:space="preserve"> </w:t>
+      </w:r>
+      <w:r>
+        <w:t xml:space="preserve">y</w:t>
+      </w:r>
+      <w:r>
+        <w:t xml:space="preserve"> </w:t>
+      </w:r>
+      <w:r>
+        <w:rPr>
+          <w:bCs/>
+          <w:b/>
+        </w:rPr>
+        <w:t xml:space="preserve">mediante qué acto</w:t>
+      </w:r>
+      <w:r>
+        <w:t xml:space="preserve"> </w:t>
+      </w:r>
+      <w:r>
+        <w:t xml:space="preserve">las fichas dejaron de estar habilitadas, y</w:t>
+      </w:r>
+      <w:r>
+        <w:t xml:space="preserve"> </w:t>
+      </w:r>
+      <w:r>
+        <w:rPr>
+          <w:bCs/>
+          <w:b/>
+        </w:rPr>
+        <w:t xml:space="preserve">por qué no se nos notificó</w:t>
+      </w:r>
+      <w:r>
+        <w:t xml:space="preserve">.</w:t>
       </w:r>
     </w:p>
     <w:p>

</xml_diff>

<commit_message>
Carta MOBIS: advertir queja por defecto de tramitación ante la Jefatura
Co-Authored-By: Claude Opus 5.5 <noreply@anthropic.com>
Claude-Session: https://claude.ai/code/session_01Ls5dNjYBLNjXxuGTDk7v3H
</commit_message>
<xml_diff>
--- a/carta-reclamo/Carta_Bartek_MOBIS_Adhesion.docx
+++ b/carta-reclamo/Carta_Bartek_MOBIS_Adhesion.docx
@@ -1460,7 +1460,49 @@
         <w:jc w:val="both"/>
       </w:pPr>
       <w:r>
-        <w:t xml:space="preserve">De no recibir respuesta en el plazo indicado, acudiremos al</w:t>
+        <w:t xml:space="preserve">De no recibir respuesta en el plazo indicado, presentaremos</w:t>
+      </w:r>
+      <w:r>
+        <w:t xml:space="preserve"> </w:t>
+      </w:r>
+      <w:r>
+        <w:rPr>
+          <w:bCs/>
+          <w:b/>
+        </w:rPr>
+        <w:t xml:space="preserve">queja por defecto de tramitación ante la Jefatura de PERÚ COMPRAS</w:t>
+      </w:r>
+      <w:r>
+        <w:t xml:space="preserve">, conforme al</w:t>
+      </w:r>
+      <w:r>
+        <w:t xml:space="preserve"> </w:t>
+      </w:r>
+      <w:r>
+        <w:rPr>
+          <w:bCs/>
+          <w:b/>
+        </w:rPr>
+        <w:t xml:space="preserve">artículo 169 del TUO de la Ley N.° 27444</w:t>
+      </w:r>
+      <w:r>
+        <w:t xml:space="preserve">, y solicitaremos el</w:t>
+      </w:r>
+      <w:r>
+        <w:t xml:space="preserve"> </w:t>
+      </w:r>
+      <w:r>
+        <w:rPr>
+          <w:bCs/>
+          <w:b/>
+        </w:rPr>
+        <w:t xml:space="preserve">deslinde de responsabilidades</w:t>
+      </w:r>
+      <w:r>
+        <w:t xml:space="preserve"> </w:t>
+      </w:r>
+      <w:r>
+        <w:t xml:space="preserve">de los servidores a cargo (artículo 261). Asimismo, acudiremos al</w:t>
       </w:r>
       <w:r>
         <w:t xml:space="preserve"> </w:t>
@@ -1505,7 +1547,7 @@
         <w:t xml:space="preserve"> </w:t>
       </w:r>
       <w:r>
-        <w:t xml:space="preserve">ocasionados.</w:t>
+        <w:t xml:space="preserve">ocasionados (artículo 260).</w:t>
       </w:r>
     </w:p>
     <w:p>

</xml_diff>